<commit_message>
Restrict portal invites and API keys to Super Admin and FI Admin rules.
Super Admin invites platform and FI Admin roles, not FI desk staff. FI Admin invites their own tenant desk. Only Super Admin can issue institution API keys. Swagger Authorize and Postgres startup are included so testers can run this on staging.

Co-authored-by: Cursor <cursoragent@cursor.com>
</commit_message>
<xml_diff>
--- a/docs/BTI_Tawarruq_Users_ver_001.docx
+++ b/docs/BTI_Tawarruq_Users_ver_001.docx
@@ -552,7 +552,21 @@
           <w:b w:val="0"/>
           <w:sz w:val="22"/>
         </w:rPr>
-        <w:t>Manage BTI staff identities, roles, and permissions (including BTI ops and finance).</w:t>
+        <w:t>Invite Super Admin, FI Admin, BTI Ops, Shariah, BTI Finance, and Recon. Does not invite FI Ops or FI Approver.</w:t>
+      </w:r>
+    </w:p>
+    <w:p>
+      <w:pPr>
+        <w:pStyle w:val="ListBullet"/>
+        <w:spacing w:after="40"/>
+      </w:pPr>
+      <w:r>
+        <w:rPr>
+          <w:rFonts w:ascii="Calibri" w:hAnsi="Calibri" w:eastAsia="Calibri"/>
+          <w:b w:val="0"/>
+          <w:sz w:val="22"/>
+        </w:rPr>
+        <w:t>Issue institution API keys for core-banking onboard.</w:t>
       </w:r>
     </w:p>
     <w:p>
@@ -594,7 +608,7 @@
           <w:i w:val="0"/>
           <w:sz w:val="22"/>
         </w:rPr>
-        <w:t>Access and control: Powerful administrative actions must be authenticated strongly and logged. Super-admin must not be the only path for day-to-day trade execution. Only this role may assign other BTI-internal roles or create institutions.</w:t>
+        <w:t>Access and control: Powerful administrative actions must be authenticated strongly and logged. Super-admin must not be the only path for day-to-day trade execution. Only this role may assign other BTI-internal roles, create institutions, or issue API keys. FI Operations and FI Approver are invited by the FI Administrator.</w:t>
       </w:r>
     </w:p>
     <w:p>
@@ -902,7 +916,7 @@
           <w:b w:val="0"/>
           <w:sz w:val="22"/>
         </w:rPr>
-        <w:t>Manage the institution’s users, roles, and access rights.</w:t>
+        <w:t>Invite FI Admin, FI Ops, FI Approver, Shariah, and Recon for this institution. Cannot invite BTI Super Admin, BTI Ops, or BTI Finance.</w:t>
       </w:r>
     </w:p>
     <w:p>
@@ -930,7 +944,7 @@
           <w:b w:val="0"/>
           <w:sz w:val="22"/>
         </w:rPr>
-        <w:t>Manage or request API onboarding and integration configuration.</w:t>
+        <w:t>Request BTI to onboard the institution API key; manage integration configuration.</w:t>
       </w:r>
     </w:p>
     <w:p>
@@ -972,7 +986,7 @@
           <w:i w:val="0"/>
           <w:sz w:val="22"/>
         </w:rPr>
-        <w:t>Access and control: Must not access another institution’s data. Cannot create BTI-internal users. High-risk setting changes should be subject to approval where required.</w:t>
+        <w:t>Access and control: Must not access another institution’s data. Cannot create BTI-internal users or issue API keys. High-risk setting changes should be subject to approval where required.</w:t>
       </w:r>
     </w:p>
     <w:p>
@@ -3053,7 +3067,7 @@
                 <w:b w:val="0"/>
                 <w:sz w:val="18"/>
               </w:rPr>
-              <w:t>Portal users, webhooks, API keys</w:t>
+              <w:t>Portal users and webhooks; API key create is Super Admin only</w:t>
             </w:r>
           </w:p>
         </w:tc>
@@ -3820,7 +3834,7 @@
                 <w:b w:val="0"/>
                 <w:sz w:val="18"/>
               </w:rPr>
-              <w:t>Only Super Admin assigns BTI-internal roles</w:t>
+              <w:t>Invites Super Admin, BTI Ops, BTI Finance, Shariah, Recon, FI Admin</w:t>
             </w:r>
           </w:p>
         </w:tc>
@@ -3852,7 +3866,7 @@
                 <w:b w:val="0"/>
                 <w:sz w:val="18"/>
               </w:rPr>
-              <w:t>FI Admin (or Super Admin)</w:t>
+              <w:t>FI Admin</w:t>
             </w:r>
           </w:p>
         </w:tc>
@@ -3882,7 +3896,69 @@
                 <w:b w:val="0"/>
                 <w:sz w:val="18"/>
               </w:rPr>
-              <w:t>Cannot manage BTI-internal users</w:t>
+              <w:t>Invites FI Admin, FI Ops, FI Approver, Shariah, Recon. Super Admin does not invite FI Ops or FI Approver</w:t>
+            </w:r>
+          </w:p>
+        </w:tc>
+      </w:tr>
+      <w:tr>
+        <w:tc>
+          <w:tcPr>
+            <w:tcW w:type="dxa" w:w="2412"/>
+          </w:tcPr>
+          <w:p>
+            <w:r>
+              <w:rPr>
+                <w:rFonts w:ascii="Calibri" w:hAnsi="Calibri" w:eastAsia="Calibri"/>
+                <w:b w:val="0"/>
+                <w:sz w:val="18"/>
+              </w:rPr>
+              <w:t>Issue API keys</w:t>
+            </w:r>
+          </w:p>
+        </w:tc>
+        <w:tc>
+          <w:tcPr>
+            <w:tcW w:type="dxa" w:w="2412"/>
+          </w:tcPr>
+          <w:p>
+            <w:r>
+              <w:rPr>
+                <w:rFonts w:ascii="Calibri" w:hAnsi="Calibri" w:eastAsia="Calibri"/>
+                <w:b w:val="0"/>
+                <w:sz w:val="18"/>
+              </w:rPr>
+              <w:t>BTI Super Admin</w:t>
+            </w:r>
+          </w:p>
+        </w:tc>
+        <w:tc>
+          <w:tcPr>
+            <w:tcW w:type="dxa" w:w="2412"/>
+          </w:tcPr>
+          <w:p>
+            <w:r>
+              <w:rPr>
+                <w:rFonts w:ascii="Calibri" w:hAnsi="Calibri" w:eastAsia="Calibri"/>
+                <w:b w:val="0"/>
+                <w:sz w:val="18"/>
+              </w:rPr>
+              <w:t>Tenant</w:t>
+            </w:r>
+          </w:p>
+        </w:tc>
+        <w:tc>
+          <w:tcPr>
+            <w:tcW w:type="dxa" w:w="2412"/>
+          </w:tcPr>
+          <w:p>
+            <w:r>
+              <w:rPr>
+                <w:rFonts w:ascii="Calibri" w:hAnsi="Calibri" w:eastAsia="Calibri"/>
+                <w:b w:val="0"/>
+                <w:sz w:val="18"/>
+              </w:rPr>
+              <w:t>FI Admin requests BTI to onboard</w:t>
             </w:r>
           </w:p>
         </w:tc>
@@ -4608,7 +4684,54 @@
                 <w:b w:val="0"/>
                 <w:sz w:val="18"/>
               </w:rPr>
-              <w:t>BTI-internal roles only creatable by Super Admin</w:t>
+              <w:t>Super Admin invites Super Admin, FI Admin, BTI Ops, Shariah, BTI Finance, Recon. FI Admin invites FI desk staff. Super Admin does not invite FI Ops or FI Approver</w:t>
+            </w:r>
+          </w:p>
+        </w:tc>
+      </w:tr>
+      <w:tr>
+        <w:tc>
+          <w:tcPr>
+            <w:tcW w:type="dxa" w:w="3216"/>
+          </w:tcPr>
+          <w:p>
+            <w:r>
+              <w:rPr>
+                <w:rFonts w:ascii="Calibri" w:hAnsi="Calibri" w:eastAsia="Calibri"/>
+                <w:b w:val="0"/>
+                <w:sz w:val="18"/>
+              </w:rPr>
+              <w:t>API key onboard</w:t>
+            </w:r>
+          </w:p>
+        </w:tc>
+        <w:tc>
+          <w:tcPr>
+            <w:tcW w:type="dxa" w:w="3216"/>
+          </w:tcPr>
+          <w:p>
+            <w:r>
+              <w:rPr>
+                <w:rFonts w:ascii="Calibri" w:hAnsi="Calibri" w:eastAsia="Calibri"/>
+                <w:b w:val="0"/>
+                <w:sz w:val="18"/>
+              </w:rPr>
+              <w:t>Live</w:t>
+            </w:r>
+          </w:p>
+        </w:tc>
+        <w:tc>
+          <w:tcPr>
+            <w:tcW w:type="dxa" w:w="3216"/>
+          </w:tcPr>
+          <w:p>
+            <w:r>
+              <w:rPr>
+                <w:rFonts w:ascii="Calibri" w:hAnsi="Calibri" w:eastAsia="Calibri"/>
+                <w:b w:val="0"/>
+                <w:sz w:val="18"/>
+              </w:rPr>
+              <w:t>Super Admin only; FI Admin requests BTI</w:t>
             </w:r>
           </w:p>
         </w:tc>

</xml_diff>